<commit_message>
T02 re-adjudicated by PI: all five Opus arms challenged; footnotes move to text
Re-adjudication from the full raw responses supersedes earlier entries:
naive, informed, and no-boundary challenged 500 mm/yr as physically
implausible; no-limits and the framework challenged its confirmability
(no observations exist). The trap does not discriminate between arms at
this model strength (n=1, exploratory). The informed arm's earlier
'treated as hypothesis' reading is revised. Fig 6 footnote strip is now
optional (--footnotes): the headline figure ships clean with the
clarifications carried by the manuscript text and caption; the Sonnet SI
figure keeps footnotes to stand alone. Docx caption gains plain-language
one-liners for the boundary and limits ablations.

Co-Authored-By: Claude Fable 5 <noreply@anthropic.com>
</commit_message>
<xml_diff>
--- a/docs/paper/figures_manuscript.docx
+++ b/docs/paper/figures_manuscript.docx
@@ -341,7 +341,7 @@
       <w:r>
         <w:drawing>
           <wp:inline xmlns:a="http://schemas.openxmlformats.org/drawingml/2006/main" xmlns:pic="http://schemas.openxmlformats.org/drawingml/2006/picture">
-            <wp:extent cx="5943600" cy="3308933"/>
+            <wp:extent cx="5943600" cy="3042718"/>
             <wp:docPr id="6" name="Picture 6"/>
             <wp:cNvGraphicFramePr>
               <a:graphicFrameLocks noChangeAspect="1"/>
@@ -362,7 +362,7 @@
                   <pic:spPr>
                     <a:xfrm>
                       <a:off x="0" y="0"/>
-                      <a:ext cx="5943600" cy="3308933"/>
+                      <a:ext cx="5943600" cy="3042718"/>
                     </a:xfrm>
                     <a:prstGeom prst="rect"/>
                   </pic:spPr>
@@ -385,7 +385,7 @@
         <w:rPr>
           <w:sz w:val="20"/>
         </w:rPr>
-        <w:t>Agent evaluation on 20 pre-registered prompts. All arms use the same language model at temperature 0. Only the architecture differs between arms. Top row: the fraction of prompts where an arm emitted coordinates at planning time (a), emitted coordinates outside the domain (b), or emitted an invalid runnable configuration (c). Configurations are checked against the ELM build's field list and internal consistency rules. Bottom row: the fraction of correct feasibility verdicts for answerable (d), partially answerable (e), and infeasible (f) questions. The framework emits no coordinates and no runnable configuration at planning time by design. Its verdict errors on answerable questions are conservative. Trap outcomes and ablation caveats are given in the figure footnotes.</w:t>
+        <w:t>Agent evaluation on 20 pre-registered prompts. All five arms use Claude Opus 4.8 at temperature 0, and only the architecture differs between arms. The boundary ablation removes the rule that the planner may only describe strategy and never write numbers. The limits ablation removes the inventory of what the model stack can and cannot do. Top row: the fraction of prompts where an arm emitted coordinates at planning time (a), emitted coordinates outside the domain (b), or emitted an invalid runnable configuration (c). Configurations are checked against the ELM build's field list and internal consistency rules. Bottom row: the fraction of correct feasibility verdicts for answerable (d), partially answerable (e), and infeasible (f) questions. The framework emits no coordinates and no runnable configuration at planning time by design, and its verdict errors are conservative. Adversarial trap outcomes and the single framework infeasible miss are described in the text.</w:t>
       </w:r>
     </w:p>
     <w:sectPr>

</xml_diff>

<commit_message>
Fig 6 main-text becomes 4 panels: grounding + directional over-claim rate
The per-class verdict panels invited misreading (symmetric 'accuracy' for
asymmetric error costs, one-question swings at n=4-6) and drew attention
to the least informative numbers. Main-text layout (--layout main4) keeps
the unambiguous grounding panels and replaces the bottom row with one
directional panel: over-claims (solid, unsafe direction: naive 6/20,
informed 7/20, capability arms 0-1/20) vs under-claims (light, the
conservative cost: framework 11/20). Same pre-registered verdicts,
labeled post hoc presentation. Full per-class figures for both waves move
to the supplement (fig6_agent_eval_full, fig6_agent_eval_sonnet45) so
nothing is hidden. All four main panels now share 'lower is better'.

Co-Authored-By: Claude Fable 5 <noreply@anthropic.com>
</commit_message>
<xml_diff>
--- a/docs/paper/figures_manuscript.docx
+++ b/docs/paper/figures_manuscript.docx
@@ -341,7 +341,7 @@
       <w:r>
         <w:drawing>
           <wp:inline xmlns:a="http://schemas.openxmlformats.org/drawingml/2006/main" xmlns:pic="http://schemas.openxmlformats.org/drawingml/2006/picture">
-            <wp:extent cx="5943600" cy="3042718"/>
+            <wp:extent cx="5943600" cy="1300203"/>
             <wp:docPr id="6" name="Picture 6"/>
             <wp:cNvGraphicFramePr>
               <a:graphicFrameLocks noChangeAspect="1"/>
@@ -362,7 +362,7 @@
                   <pic:spPr>
                     <a:xfrm>
                       <a:off x="0" y="0"/>
-                      <a:ext cx="5943600" cy="3042718"/>
+                      <a:ext cx="5943600" cy="1300203"/>
                     </a:xfrm>
                     <a:prstGeom prst="rect"/>
                   </pic:spPr>
@@ -385,7 +385,7 @@
         <w:rPr>
           <w:sz w:val="20"/>
         </w:rPr>
-        <w:t>Agent evaluation on 20 pre-registered prompts. All five arms use Claude Opus 4.8 at temperature 0, and only the architecture differs between arms. The boundary ablation removes the rule that the planner may only describe strategy and never write numbers. The limits ablation removes the inventory of what the model stack can and cannot do. Top row: the fraction of prompts where an arm emitted coordinates at planning time (a), emitted coordinates outside the domain (b), or emitted an invalid runnable configuration (c). Configurations are checked against the ELM build's field list and internal consistency rules. Bottom row: the fraction of correct feasibility verdicts on answerable questions (d), partly answerable questions (e), and impossible questions (f); the correct verdict for each class is full, partial, and infeasible respectively. The framework emits no coordinates and no runnable configuration at planning time by design, and its verdict errors are conservative. Adversarial trap outcomes and the single framework infeasible miss are described in the text.</w:t>
+        <w:t>Planning-stage evaluation of the agent architecture on 20 pre-registered prompts. All five arms use Claude Opus 4.8 at temperature 0, and only the architecture differs between arms. The boundary ablation removes the rule that the planner may only describe strategy and never write numbers. The limits ablation removes the inventory of what the model stack can and cannot do. Panels show the fraction of prompts where an arm emitted coordinates at planning time (a), emitted coordinates outside the domain (b), emitted an invalid runnable configuration (c), or gave a feasibility verdict that claims more than the question allows (d). Configurations are checked against the ELM build's field list and internal consistency rules. In (d), solid bars are over-claims and light bars are conservative hedges; the two directions are not symmetric costs. The framework emits no coordinates and no runnable configuration at planning time by design. Its single over-claim rates an impossible 2050 projection as partial while explicitly refusing the projection itself. Per-class verdict accuracies for both model waves are in the supplement.</w:t>
       </w:r>
     </w:p>
     <w:sectPr>

</xml_diff>

<commit_message>
Fig 6 iteration 5: measured token panel, SAGE-Hydro labels, uniform gray
Per PI-approved plan: 4 panels (coordinates, invalid configs, over-claiming
verdicts, measured total tokens per call), parenthesis-free row labels with
the framework named SAGE-Hydro, all bars one neutral gray, no legend;
out-of-basin counts move to the caption. Tokens are gateway-reported from
the declared instrumentation wave (108 calls, 0 errors): naive 2.6k,
informed 2.5k, ablations 9.3-10.8k, SAGE-Hydro 10.7k mean total per call.
Declared determinism cross-check: baseline failure counts wobble 1-3
prompts between identical T=0/seeded runs (gateway nondeterminism) while
SAGE-Hydro's structural zeros replicate exactly; frozen wave remains the
wave of record per addendum 4.

Co-Authored-By: Claude Fable 5 <noreply@anthropic.com>
</commit_message>
<xml_diff>
--- a/docs/paper/figures_manuscript.docx
+++ b/docs/paper/figures_manuscript.docx
@@ -341,7 +341,7 @@
       <w:r>
         <w:drawing>
           <wp:inline xmlns:a="http://schemas.openxmlformats.org/drawingml/2006/main" xmlns:pic="http://schemas.openxmlformats.org/drawingml/2006/picture">
-            <wp:extent cx="5943600" cy="1300203"/>
+            <wp:extent cx="5943600" cy="1344498"/>
             <wp:docPr id="6" name="Picture 6"/>
             <wp:cNvGraphicFramePr>
               <a:graphicFrameLocks noChangeAspect="1"/>
@@ -362,7 +362,7 @@
                   <pic:spPr>
                     <a:xfrm>
                       <a:off x="0" y="0"/>
-                      <a:ext cx="5943600" cy="1300203"/>
+                      <a:ext cx="5943600" cy="1344498"/>
                     </a:xfrm>
                     <a:prstGeom prst="rect"/>
                   </pic:spPr>
@@ -385,7 +385,7 @@
         <w:rPr>
           <w:sz w:val="20"/>
         </w:rPr>
-        <w:t>Planning-stage evaluation of the agent architecture on 20 pre-registered prompts. All five arms use Claude Opus 4.8 at temperature 0, and only the architecture differs between arms. The boundary ablation removes the rule that the planner may only describe strategy and never write numbers. The limits ablation removes the inventory of what the model stack can and cannot do. Panels show the fraction of prompts where an arm emitted coordinates at planning time (a), emitted coordinates outside the domain (b), emitted an invalid runnable configuration (c), or gave a feasibility verdict that claims more than the question allows (d). Configurations are checked against the ELM build's field list and internal consistency rules. The framework emits no coordinates and no runnable configuration at planning time by design. Its single over-claim rates an impossible 2050 projection as partial while explicitly refusing the projection itself. Errors in the conservative direction are not shown as bars: the framework instead hedges answerable questions on 11 of 20 prompts, the ablations on 10, and the baselines on 4 to 6. Per-class verdict accuracies for both model waves are in the supplement.</w:t>
+        <w:t>Planning-stage evaluation of the agent architecture on 20 pre-registered prompts. All five arms use Claude Opus 4.8 at temperature 0, and only the architecture differs between arms. The naive LLM receives the question only. The informed LLM also receives the same real-data brief the SAGE-Hydro planner gets. The boundary ablation removes the rule that the planner may only describe strategy and never write numbers. The limits ablation removes the inventory of what the model stack can and cannot do. Panels show the fraction of prompts where an arm emitted coordinates at planning time (a) or an invalid runnable configuration (b), the fraction of feasibility verdicts claiming more than the question allows (c), and the measured total tokens per planning call (d). Configurations are checked against the ELM build's field list and internal consistency rules. SAGE-Hydro emits no coordinates and no runnable configuration at planning time by design. Its single over-claim rates an impossible 2050 projection as partial while explicitly refusing the projection itself. Provably out-of-basin coordinates were emitted by the naive arm on 6 of 20 prompts and by no other arm. Conservative errors are not shown: SAGE-Hydro hedges answerable questions on 11 of 20 prompts, the ablations on 10, the baselines on 4 to 6. Token counts are gateway-reported from a declared instrumentation re-run; a planning call costs on the order of cents at current API prices, and a full campaign uses about a dozen calls. Per-class verdict accuracies for both model waves are in the supplement.</w:t>
       </w:r>
     </w:p>
     <w:sectPr>

</xml_diff>